<commit_message>
contracts, dorm rules etc.
</commit_message>
<xml_diff>
--- a/docs/demo/NEST_PH_Walkthrough_Script_Hybrid_REVISED.docx
+++ b/docs/demo/NEST_PH_Walkthrough_Script_Hybrid_REVISED.docx
@@ -1699,7 +1699,7 @@
           <w:sz w:val="22"/>
           <w:szCs w:val="22"/>
         </w:rPr>
-        <w:t>Ana (Ana Beatriz Salonga, ana.salonga@gmail.com): her application is already submitted and Pending for Room 202, Bed 2, with signed contract and ID. Her payment proof is the file docs/demo/Ana_move-in_payment_proof.png (PHP 9,500). She has no password yet. She gets one by email when the owner approves her.</w:t>
+        <w:t>Ana (Ana Beatriz Salonga, ana.salonga@gmail.com): her application is already submitted and Pending for Room 202, Bed 2, with signed contract and ID. Her payment proof is the file docs/demo/Ana_move-in_payment_proof.png (PHP 8,400). She has no password yet. She gets one by email when the owner approves her.</w:t>
       </w:r>
     </w:p>
     <w:p>
@@ -2927,7 +2927,7 @@
           <w:sz w:val="22"/>
           <w:szCs w:val="22"/>
         </w:rPr>
-        <w:t>In Window B, log in as Ana (ana.salonga@gmail.com) and paste the temporary password from Mailtrap. Show that she can only reach the billing page. Upload docs/demo/Ana_move-in_payment_proof.png as her proof (PHP 9,500). Back in Window A, approve the proof.</w:t>
+        <w:t>In Window B, log in as Ana (ana.salonga@gmail.com) and paste the temporary password from Mailtrap. Show that she can only reach the billing page. Upload docs/demo/Ana_move-in_payment_proof.png as her proof (PHP 8,400). Back in Window A, approve the proof.</w:t>
       </w:r>
     </w:p>
     <w:p>

</xml_diff>

<commit_message>
Add forecast tab to reports
</commit_message>
<xml_diff>
--- a/docs/demo/NEST_PH_Walkthrough_Script_Hybrid_REVISED.docx
+++ b/docs/demo/NEST_PH_Walkthrough_Script_Hybrid_REVISED.docx
@@ -1753,7 +1753,7 @@
           <w:sz w:val="22"/>
           <w:szCs w:val="22"/>
         </w:rPr>
-        <w:t>Room 102 has 2 VR photos and no arrow yet between them, so Vince can add one live. Room 101 already has arrows for Ana to click in step 1.3.</w:t>
+        <w:t>Room 105 (a solo fan room with its one bed vacant) is the only room with a VR tour. It has 2 photos, Living Room and Computer Room, and no arrow yet between them, so Vince can add one live in step 1.5. Rooms 101 and 102 are full, so they do not appear on the public VR Tour page.</w:t>
       </w:r>
     </w:p>
     <w:p>
@@ -2344,7 +2344,7 @@
           <w:sz w:val="22"/>
           <w:szCs w:val="22"/>
         </w:rPr>
-        <w:t>Open Room 101's VR preview. Drag the view left, right, up, and down. Click an arrow to move from the Lobby to the Living Room.</w:t>
+        <w:t>Open the VR Tour page and open Room 105's tour. Drag the view left, right, up, and down.</w:t>
       </w:r>
     </w:p>
     <w:p>
@@ -2375,7 +2375,7 @@
           <w:sz w:val="22"/>
           <w:szCs w:val="22"/>
         </w:rPr>
-        <w:t xml:space="preserve">"Instead of static photos, Ana looks around a 360-degree view of the room, as if she were standing inside. These arrows connect the photos so she can walk through the dorm. If a room has no VR content yet, the system falls back to regular photos."</w:t>
+        <w:t>"Instead of static photos, Ana looks around a 360-degree view of the room, as if she were standing inside. In a moment we will connect the photos with arrows so she can walk through the dorm. If a room has no VR content yet, the system falls back to regular photos."</w:t>
       </w:r>
     </w:p>
     <w:p>
@@ -2401,7 +2401,7 @@
           <w:sz w:val="20"/>
           <w:szCs w:val="20"/>
         </w:rPr>
-        <w:t xml:space="preserve">Table 30. If you can, show one room with no VR to prove the fallback.</w:t>
+        <w:t>Table 30. If you can, open another room (for example Room 101) to show the fallback to regular photos.</w:t>
       </w:r>
     </w:p>
     <w:p>
@@ -2562,7 +2562,7 @@
           <w:sz w:val="22"/>
           <w:szCs w:val="22"/>
         </w:rPr>
-        <w:t>Switch to Window A. Open VR Management, then open Room 102. Show the photo list. Click Add Arrow, click a spot on the photo, choose where it leads, and Save. Then show the Visibility options: Public, Locked, Draft.</w:t>
+        <w:t>Switch to Window A. Open VR Management, then open Room 105. Show the photo list. Click Add Arrow, click a spot on the Living Room photo, choose Computer Room, and Save. Then show the Visibility options: Public, Locked, Draft.</w:t>
       </w:r>
     </w:p>
     <w:p>
@@ -2593,7 +2593,7 @@
           <w:sz w:val="22"/>
           <w:szCs w:val="22"/>
         </w:rPr>
-        <w:t xml:space="preserve">"Now the owner's side. Each photo is one spot a visitor can stand in. To connect two spots, the owner clicks where the door is and picks where it leads. That is how the arrows Ana used were made. The owner can also set a tour to Draft, so visitors never see an unfinished tour."</w:t>
+        <w:t>"Now the owner's side. Each photo is one spot a visitor can stand in. To connect two spots, the owner clicks where the door is and picks where it leads. That arrow is how a visitor walks from one spot to the next. The owner can also set a tour to Draft, so visitors never see an unfinished tour."</w:t>
       </w:r>
     </w:p>
     <w:p>
@@ -2671,7 +2671,7 @@
           <w:sz w:val="22"/>
           <w:szCs w:val="22"/>
         </w:rPr>
-        <w:t>Refresh Window B and open Room 102's tour. Click the new arrow.</w:t>
+        <w:t>Refresh Window B and open Room 105's tour. Click the new arrow to go from the Living Room to the Computer Room.</w:t>
       </w:r>
     </w:p>
     <w:p>
@@ -2702,7 +2702,7 @@
           <w:sz w:val="22"/>
           <w:szCs w:val="22"/>
         </w:rPr>
-        <w:t xml:space="preserve">"The change is live immediately."</w:t>
+        <w:t>"The change is live immediately. Ana can now walk from the living room to the computer room."</w:t>
       </w:r>
     </w:p>
     <w:p>
@@ -2728,7 +2728,7 @@
           <w:sz w:val="20"/>
           <w:szCs w:val="20"/>
         </w:rPr>
-        <w:t xml:space="preserve">Optional. Skip this if you are running behind.</w:t>
+        <w:t>Do not skip. This is the only time the panel sees an arrow being clicked.</w:t>
       </w:r>
     </w:p>
     <w:p>
@@ -4214,7 +4214,7 @@
           <w:sz w:val="22"/>
           <w:szCs w:val="22"/>
         </w:rPr>
-        <w:t xml:space="preserve">In Window A, open Reports. Generate the Occupancy and Financial reports. Export one as CSV.</w:t>
+        <w:t>In Window A, open Reports. Generate the Occupancy and Financial reports. Export one as Excel or PDF.</w:t>
       </w:r>
     </w:p>
     <w:p>
@@ -4245,7 +4245,7 @@
           <w:sz w:val="22"/>
           <w:szCs w:val="22"/>
         </w:rPr>
-        <w:t xml:space="preserve">"The owner can turn all of this data into reports. Here are the Occupancy and Financial reports, exportable as CSV."</w:t>
+        <w:t>"The owner can turn all of this data into reports. Here are the Occupancy and Financial reports, exportable as Excel or PDF."</w:t>
       </w:r>
     </w:p>
     <w:p>
@@ -4576,7 +4576,7 @@
           <w:sz w:val="22"/>
           <w:szCs w:val="22"/>
         </w:rPr>
-        <w:t>Ben or Ana was already used in rehearsal: re-run php artisan db:seed --class=DemoDataSeeder. It resets Ben to Stage 2 and Ana to Pending, and removes the arrow added in Room 102.</w:t>
+        <w:t>Ben or Ana was already used in rehearsal: re-run php artisan db:seed --class=DemoDataSeeder. It resets Ben to Stage 2 and Ana to Pending, and removes the arrow added in Room 105.</w:t>
       </w:r>
     </w:p>
     <w:p>
@@ -4594,7 +4594,7 @@
           <w:sz w:val="22"/>
           <w:szCs w:val="22"/>
         </w:rPr>
-        <w:t xml:space="preserve">Running late: skip steps 1.6 and 5.2, and shorten 3.5. This saves about 1 minute 30 seconds.</w:t>
+        <w:t>Running late: skip step 5.2, and shorten 3.1 and 3.5. This saves about 1 minute 20 seconds. Do not skip 1.6.</w:t>
       </w:r>
     </w:p>
     <w:p>

</xml_diff>